<commit_message>
Research report: describe Vietnam 2010/11 as a level shift, not a series break
USDA shows Vietnam at 17-19.5 M bags from 2006/07 to 2010/11, then 26.0 M
in 2011/12 (+34 %). Exports follow (+31 %), official Vietnamese statistics
(FAOSTAT) show +15 %. The report now says this, explains why the robusta
analysis starts in 2011/12, and states that Vietnam remains the largest
robusta producer by volume even though conilon drives more of the swings.

Co-Authored-By: Claude Opus 5.5 <noreply@anthropic.com>
Claude-Session: https://claude.ai/code/session_01Hsy3bDWLR2oyncbyTiqnwU
</commit_message>
<xml_diff>
--- a/coffee_stu/Recherche_STU_prix_cafe.docx
+++ b/coffee_stu/Recherche_STU_prix_cafe.docx
@@ -110,7 +110,7 @@
         <w:t xml:space="preserve">Robusta : le conilon brésilien est le premier moteur. </w:t>
       </w:r>
       <w:r>
-        <w:t xml:space="preserve">Depuis 2011/12, il fait l'essentiel de la croissance de l'offre robusta (+0,75 M sacs par an, contre +0,22 pour le Vietnam) et 53 % de ses à-coups (Vietnam 26 %, Indonésie 19 %). Les récoltes du Vietnam et du conilon ne se suivent pas.</w:t>
+        <w:t xml:space="preserve">Depuis 2011/12, il fait l'essentiel de la croissance de l'offre robusta (+0,75 M sacs par an, contre +0,22 pour le Vietnam) et 53 % de ses à-coups (Vietnam 26 %, Indonésie 19 %), même si le Vietnam reste le premier producteur en volume. Les récoltes du Vietnam et du conilon ne se suivent pas.</w:t>
       </w:r>
     </w:p>
     <w:p>
@@ -6777,7 +6777,7 @@
         <w:pStyle w:val="Caption"/>
       </w:pPr>
       <w:r>
-        <w:t xml:space="preserve">Graphique 6 — Tendance de la production par origine, 2011/12-2025/26 (M sacs par an). 2010/11 exclue : rupture de série au Vietnam.</w:t>
+        <w:t xml:space="preserve">Graphique 6 — Tendance de la production par origine, 2011/12-2025/26 (M sacs par an). 2010/11 exclue : saut de niveau du Vietnam entre 2010/11 et 2011/12.</w:t>
       </w:r>
     </w:p>
     <w:p>
@@ -7943,12 +7943,12 @@
         <w:pStyle w:val="Note"/>
       </w:pPr>
       <w:r>
-        <w:t xml:space="preserve">Parts (entre ces cinq origines), écarts types et tendances sur 2011/12-2025/26 ; corrélations sur les croissances 2012/13-2025/26 (n = 14). 2010/11 exclue : rupture de série au Vietnam.</w:t>
-      </w:r>
-    </w:p>
-    <w:p>
-      <w:r>
-        <w:t xml:space="preserve">Lecture : depuis 2011/12, le conilon brésilien pèse environ deux fois plus que le Vietnam dans les à-coups de l'offre robusta (53 % contre 26 % ; Indonésie 19 %) et il fait l'essentiel de sa croissance (+0,75 M sacs par an contre +0,22). Le chiffre vietnamien de 2010/11 (19,4 M sacs, puis 26,0 M l'année suivante) est une rupture de série : il a été écarté. Les récoltes du Vietnam et du conilon ne se suivent pas (corrélations de −0,55 à +0,35 selon le décalage de −2 à +2 ans, rien de significatif). Le DF est lié à la récolte robusta mondiale de la campagne USDA (r = −0,61), mais ce lien disparaît si l'on cale les récoltes sur leurs dates (−0,13) : c'est un indice, pas un résultat établi. Le Vietnam et l'Indonésie produisent un peu plus l'année qui suit un DF élevé (+0,38 et +0,47, non significatifs) ; pour le conilon, on ne détecte aucune réponse au DF en dollars, mais le test est peu puissant et le prix en réals n'a pas été testé. Réponse à votre question : ni « le Vietnam mène et le Brésil suit », ni l'inverse, de façon démontrable. Le conilon est le premier moteur de l'offre robusta, en croissance comme en à-coups.</w:t>
+        <w:t xml:space="preserve">Parts (entre ces cinq origines), écarts types et tendances sur 2011/12-2025/26 ; corrélations sur les croissances 2012/13-2025/26 (n = 14). 2010/11 exclue : saut de niveau du Vietnam (19,4 puis 26,0 M sacs).</w:t>
+      </w:r>
+    </w:p>
+    <w:p>
+      <w:r>
+        <w:t xml:space="preserve">Lecture : depuis 2011/12, le conilon brésilien pèse environ deux fois plus que le Vietnam dans les à-coups de l'offre robusta (53 % contre 26 % ; Indonésie 19 %) et il fait l'essentiel de sa croissance (+0,75 M sacs par an contre +0,22). Le Vietnam reste pourtant le premier producteur en volume (31,7 M sacs en 2025/26, 38 % du robusta mondial, contre 25,0 M pour le conilon). Pourquoi partir de 2011/12 ? Le Vietnam a fait un saut de niveau : 19,4 M sacs en 2010/11, 26,0 M en 2011/12 (+34 % en un an, après 17 à 19,5 M sacs de 2006/07 à 2010/11). Ses exportations suivent (18,6 puis 24,5 M sacs), mais la statistique officielle vietnamienne (FAOSTAT) ne montre que +15 %. Réel ou en partie une révision des estimations, ce saut n'est pas un à-coup de récolte : compté comme un écart à la tendance, il ferait passer le Vietnam pour aussi instable que le conilon (41 % chacun). Les récoltes du Vietnam et du conilon ne se suivent pas (corrélations de −0,55 à +0,35 selon le décalage de −2 à +2 ans, rien de significatif). Le DF est lié à la récolte robusta mondiale de la campagne USDA (r = −0,61), mais ce lien disparaît si l'on cale les récoltes sur leurs dates (−0,13) : c'est un indice, pas un résultat établi. Le Vietnam et l'Indonésie produisent un peu plus l'année qui suit un DF élevé (+0,38 et +0,47, non significatifs) ; pour le conilon, on ne détecte aucune réponse au DF en dollars, mais le test est peu puissant et le prix en réals n'a pas été testé. Réponse à votre question : ni « le Vietnam mène et le Brésil suit », ni l'inverse, de façon démontrable. Le conilon est le premier moteur de l'offre robusta, en croissance comme en à-coups.</w:t>
       </w:r>
     </w:p>
     <w:p>
@@ -9873,7 +9873,7 @@
         </w:numPr>
       </w:pPr>
       <w:r>
-        <w:t xml:space="preserve">Crise et reprise (section 5) : simples différences de moyennes, sans modèle. Tendances et parts de l'offre robusta et arabica sur 2011/12-2025/26 (rupture de série au Vietnam en 2010/11).</w:t>
+        <w:t xml:space="preserve">Crise et reprise (section 5) : simples différences de moyennes, sans modèle. Tendances et parts de l'offre robusta et arabica sur 2011/12-2025/26 (saut de niveau du Vietnam entre 2010/11 et 2011/12).</w:t>
       </w:r>
     </w:p>
     <w:p>

</xml_diff>

<commit_message>
Research report: who moves first, KC or DF, on daily prices
Adds daily KC1 / DF1 / USD-BRL prices (June 2021 to May 2026, public copy
of Yahoo Finance and Investing.com data, checked against ICO monthly
averages) and the lead-lag tests: lagged correlations, Granger tests,
reaction after large shocks, the London/New York closing-time gap (DST
mismatch weeks) and weekly returns. Neither market leads: both move the
same day (r = 0.67) and nothing shows the next day. New section text,
charts d15-d16 and Excel sheet 9_Quotidien; the real is now measured.

Co-Authored-By: Claude Opus 5.5 <noreply@anthropic.com>
Claude-Session: https://claude.ai/code/session_01Hsy3bDWLR2oyncbyTiqnwU
</commit_message>
<xml_diff>
--- a/coffee_stu/Recherche_STU_prix_cafe.docx
+++ b/coffee_stu/Recherche_STU_prix_cafe.docx
@@ -128,7 +128,7 @@
         <w:t xml:space="preserve">KC et DF bougent ensemble, mais ce ne sont pas des jumeaux. </w:t>
       </w:r>
       <w:r>
-        <w:t xml:space="preserve">Corrélation des variations mensuelles : 0,70 (0,78 depuis 2021), contre 0,97 à 0,99 entre arabicas. Le lien vient du marché (substitution dans les mélanges, Brésil, dollar, fonds), pas de récoltes synchronisées. Le ratio KC/DF (1,87 en août 2026, moyenne 1,82) s'écarte quand une seule espèce subit un choc. Aucun des deux marchés ne mène l'autre.</w:t>
+        <w:t xml:space="preserve">Corrélation des variations mensuelles : 0,70 (0,78 depuis 2021), contre 0,97 à 0,99 entre arabicas. Le lien vient du marché (substitution dans les mélanges, Brésil, dollar, fonds), pas de récoltes synchronisées. Le ratio KC/DF (1,87 en août 2026, moyenne 1,82) s'écarte quand une seule espèce subit un choc. Aucun des deux ne mène l'autre, même au jour près : ils bougent le même jour (0,67 sur 2021-2026) et rien ne se voit le lendemain.</w:t>
       </w:r>
     </w:p>
     <w:p>
@@ -9573,7 +9573,7 @@
         <w:t xml:space="preserve">Les facteurs communs. </w:t>
       </w:r>
       <w:r>
-        <w:t xml:space="preserve">Le Brésil produit 40 % de l'arabica mondial et 30 % du robusta (2025/26) : le real brésilien et le rythme de vente des producteurs brésiliens pèsent sur les deux prix. S'y ajoutent le dollar, les flux des fonds, les taux et le fret. Ces facteurs ne sont pas mesurés ici (pas de séries de change ni de positions des fonds dans les données).</w:t>
+        <w:t xml:space="preserve">Le Brésil produit 40 % de l'arabica mondial et 30 % du robusta (2025/26) : le real brésilien et le rythme de vente des producteurs brésiliens pèsent sur les deux prix. Mesuré au pas hebdomadaire sur 2021-2026, le real compte, mais peu pour le lien entre les deux : quand il faiblit, le KC et le DF baissent (corrélations −0,20 et −0,23 avec USD/BRL), mais le lien KC/DF reste presque entier une fois le real retiré (0,71, contre 0,73). Le dollar, les flux des fonds, les taux et le fret ne sont pas mesurés ici.</w:t>
       </w:r>
     </w:p>
     <w:p>
@@ -9749,12 +9749,132 @@
         <w:keepNext/>
       </w:pPr>
       <w:r>
-        <w:t xml:space="preserve">Qui mène ?</w:t>
-      </w:r>
-    </w:p>
-    <w:p>
-      <w:r>
-        <w:t xml:space="preserve">Personne, au pas mensuel : les deux bougent le même mois. Les petites corrélations décalées d'un mois (DF avant KC : 0,19 ; KC avant DF : 0,14) sont exactement ce que produit le calcul sur des moyennes mensuelles : deux prix parfaitement simultanés donnent environ 0,17 dans les deux sens (simulation de 400 paires de marches aléatoires journalières, moyennées par mois). Pour savoir qui bouge en premier dans la semaine, il faudrait des cours quotidiens.</w:t>
+        <w:t xml:space="preserve">Qui mène ? Au jour près, personne</w:t>
+      </w:r>
+    </w:p>
+    <w:p>
+      <w:r>
+        <w:t xml:space="preserve">Au pas mensuel, les deux bougent le même mois ; les petites corrélations décalées d'un mois (0,19 et 0,14) ne sont qu'un effet du calcul sur des moyennes mensuelles (environ 0,17 attendus dans les deux sens). Pour trancher, on a repris les cours quotidiens de juin 2021 à mai 2026 (1 233 jours communs ; KC : Yahoo Finance KC=F ; DF : robusta de Londres, Investing.com ; moyennes mensuelles contrôlées contre l'ICO, corrélations de 0,9987 et 0,9997).</w:t>
+      </w:r>
+    </w:p>
+    <w:p>
+      <w:pPr>
+        <w:pStyle w:val="Figure"/>
+        <w:keepNext/>
+      </w:pPr>
+      <w:r>
+        <w:drawing>
+          <wp:inline distT="0" distB="0" distL="0" distR="0">
+            <wp:extent cx="5940000" cy="2585849"/>
+            <wp:docPr id="15" name="Graphique 15"/>
+            <wp:cNvGraphicFramePr>
+              <a:graphicFrameLocks noChangeAspect="1"/>
+            </wp:cNvGraphicFramePr>
+            <a:graphic>
+              <a:graphicData uri="http://schemas.openxmlformats.org/drawingml/2006/picture">
+                <pic:pic>
+                  <pic:nvPicPr>
+                    <pic:cNvPr id="15" name="graphique15.png"/>
+                    <pic:cNvPicPr/>
+                  </pic:nvPicPr>
+                  <pic:blipFill>
+                    <a:blip r:embed="rIdImg15"/>
+                    <a:stretch>
+                      <a:fillRect/>
+                    </a:stretch>
+                  </pic:blipFill>
+                  <pic:spPr>
+                    <a:xfrm>
+                      <a:off x="0" y="0"/>
+                      <a:ext cx="5940000" cy="2585849"/>
+                    </a:xfrm>
+                    <a:prstGeom prst="rect">
+                      <a:avLst/>
+                    </a:prstGeom>
+                  </pic:spPr>
+                </pic:pic>
+              </a:graphicData>
+            </a:graphic>
+          </wp:inline>
+        </w:drawing>
+      </w:r>
+    </w:p>
+    <w:p>
+      <w:pPr>
+        <w:pStyle w:val="Caption"/>
+      </w:pPr>
+      <w:r>
+        <w:t xml:space="preserve">Graphique 15 — Corrélation des variations quotidiennes du KC et du DF selon le décalage, juin 2021 – mai 2026.</w:t>
+      </w:r>
+    </w:p>
+    <w:p>
+      <w:r>
+        <w:t xml:space="preserve">Résultat : les deux marchés bougent le même jour (r = 0,67). Le lendemain, plus rien : variation du KC un jour contre celle du DF le lendemain −0,03, et l'inverse −0,03 (aucune n'est significative ; écart entre les deux 0,00, intervalle bootstrap à 90 % de −0,05 à +0,04). Les tests de Granger (5 jours de retard) ne trouvent pas d'avance non plus (p = 0,09 du KC vers le DF, 0,56 du DF vers le KC ; 0,35 et 0,21 sans les 12 jours extrêmes). Les barres à ±2 jours viennent de l'autocorrélation propre de chaque marché à 2 jours (+0,07 pour le KC, +0,08 pour le DF), pas d'une avance. Au pas hebdomadaire : 0,69 la même semaine, rien de significatif à une semaine d'écart (+0,02 et +0,04).</w:t>
+      </w:r>
+    </w:p>
+    <w:p>
+      <w:pPr>
+        <w:pStyle w:val="Figure"/>
+        <w:keepNext/>
+      </w:pPr>
+      <w:r>
+        <w:drawing>
+          <wp:inline distT="0" distB="0" distL="0" distR="0">
+            <wp:extent cx="5940000" cy="2585849"/>
+            <wp:docPr id="16" name="Graphique 16"/>
+            <wp:cNvGraphicFramePr>
+              <a:graphicFrameLocks noChangeAspect="1"/>
+            </wp:cNvGraphicFramePr>
+            <a:graphic>
+              <a:graphicData uri="http://schemas.openxmlformats.org/drawingml/2006/picture">
+                <pic:pic>
+                  <pic:nvPicPr>
+                    <pic:cNvPr id="16" name="graphique16.png"/>
+                    <pic:cNvPicPr/>
+                  </pic:nvPicPr>
+                  <pic:blipFill>
+                    <a:blip r:embed="rIdImg16"/>
+                    <a:stretch>
+                      <a:fillRect/>
+                    </a:stretch>
+                  </pic:blipFill>
+                  <pic:spPr>
+                    <a:xfrm>
+                      <a:off x="0" y="0"/>
+                      <a:ext cx="5940000" cy="2585849"/>
+                    </a:xfrm>
+                    <a:prstGeom prst="rect">
+                      <a:avLst/>
+                    </a:prstGeom>
+                  </pic:spPr>
+                </pic:pic>
+              </a:graphicData>
+            </a:graphic>
+          </wp:inline>
+        </w:drawing>
+      </w:r>
+    </w:p>
+    <w:p>
+      <w:pPr>
+        <w:pStyle w:val="Caption"/>
+      </w:pPr>
+      <w:r>
+        <w:t xml:space="preserve">Graphique 16 — Mouvement moyen de l'autre marché après un gros choc (plus de 2 écarts types) : le jour même, le lendemain et deux jours après.</w:t>
+      </w:r>
+    </w:p>
+    <w:p>
+      <w:r>
+        <w:t xml:space="preserve">Après un gros choc sur un marché (environ 5 %), l'autre bouge dans le même sens le jour même, d'à peu près la moitié (DF +2,9 % après un gros mouvement du KC ; KC +2,8 % après un gros mouvement du DF), puis plus rien : le lendemain −0,3 % et −0,3 %, non significatifs. La transmission est immédiate et partielle, dans les deux sens.</w:t>
+      </w:r>
+    </w:p>
+    <w:p>
+      <w:r>
+        <w:t xml:space="preserve">Le piège des heures de clôture a été vérifié. Londres clôture à 17h30 heure de Londres et New York à 13h30 heure de New York, soit une heure plus tard presque toute l'année : les nouvelles de cette heure entrent dans le KC du jour et dans le DF du lendemain, ce qui pourrait fabriquer une fausse avance du KC. On ne la voit pas (−0,02 les jours décalés). Les 89 jours où les deux clôtures tombent au même instant (de mi-mars à fin mars, de fin octobre à début novembre, quand un seul des deux pays est passé à l'heure d'été ou d'hiver) montrent un léger effet de retour, symétrique (−0,26 et −0,32) : toujours pas de meneur. Ces semaines sont aussi des semaines d'échéance.</w:t>
+      </w:r>
+    </w:p>
+    <w:p>
+      <w:r>
+        <w:t xml:space="preserve">Ce qu'on ne peut pas dire : qui bouge en premier à l'intérieur de la journée. Il faudrait des cours intrajournaliers.</w:t>
       </w:r>
     </w:p>
     <w:p>
@@ -9837,7 +9957,7 @@
         </w:numPr>
       </w:pPr>
       <w:r>
-        <w:t xml:space="preserve">STU mondial = stocks de fin ÷ (consommation + exportations). Importateurs : stocks ÷ consommation. Producteurs = 42 pays exportateurs nets.</w:t>
+        <w:t xml:space="preserve">Cours quotidiens (section 8) : copie publique datée du 1er octobre 2026 (dépôt GitHub axelcohen75/coffee-dashboard) de KC=F (Yahoo Finance) et du robusta de Londres (Investing.com), contrat le plus proche, sans ajustement des changements de contrat, et de USD/BRL (Yahoo). Contrôle : moyennes mensuelles contre l'ICO. Robustesse : sans les 12 jours extrêmes (changements de contrat probables), corrélations de rang, pas hebdomadaire ; mêmes conclusions.</w:t>
       </w:r>
     </w:p>
     <w:p>
@@ -9849,7 +9969,7 @@
         </w:numPr>
       </w:pPr>
       <w:r>
-        <w:t xml:space="preserve">Décomposition (section 3) : identité exacte des stocks mondiaux ; chaque production, chaque consommation et l'écart des échanges sont séparés en une tendance et un écart ; on mesure la part de chaque écart dans la variance des variations annuelles du STU. Résultat stable avec une tendance log-linéaire ; intervalles par bootstrap. D'autres méthodes d'attribution donnent d'autres parts : seul le premier rang (arabica brésilien) est solide.</w:t>
+        <w:t xml:space="preserve">STU mondial = stocks de fin ÷ (consommation + exportations). Importateurs : stocks ÷ consommation. Producteurs = 42 pays exportateurs nets.</w:t>
       </w:r>
     </w:p>
     <w:p>
@@ -9861,7 +9981,7 @@
         </w:numPr>
       </w:pPr>
       <w:r>
-        <w:t xml:space="preserve">Corrélations de niveau : p corrigés de l'autocorrélation (n effectif) et validation croisée (une campagne retirée à la fois). 88 corrélations annuelles pays par pays testées : aucune ne résiste à une correction pour tests multiples (Benjamini-Hochberg à 10 %).</w:t>
+        <w:t xml:space="preserve">Décomposition (section 3) : identité exacte des stocks mondiaux ; chaque production, chaque consommation et l'écart des échanges sont séparés en une tendance et un écart ; on mesure la part de chaque écart dans la variance des variations annuelles du STU. Résultat stable avec une tendance log-linéaire ; intervalles par bootstrap. D'autres méthodes d'attribution donnent d'autres parts : seul le premier rang (arabica brésilien) est solide.</w:t>
       </w:r>
     </w:p>
     <w:p>
@@ -9873,7 +9993,7 @@
         </w:numPr>
       </w:pPr>
       <w:r>
-        <w:t xml:space="preserve">Crise et reprise (section 5) : simples différences de moyennes, sans modèle. Tendances et parts de l'offre robusta et arabica sur 2011/12-2025/26 (saut de niveau du Vietnam entre 2010/11 et 2011/12).</w:t>
+        <w:t xml:space="preserve">Corrélations de niveau : p corrigés de l'autocorrélation (n effectif) et validation croisée (une campagne retirée à la fois). 88 corrélations annuelles pays par pays testées : aucune ne résiste à une correction pour tests multiples (Benjamini-Hochberg à 10 %).</w:t>
       </w:r>
     </w:p>
     <w:p>
@@ -9885,7 +10005,7 @@
         </w:numPr>
       </w:pPr>
       <w:r>
-        <w:t xml:space="preserve">Pièges des données : la consommation de l'UE est apparente (miroir des stocks) et le périmètre passe de 28 à 27 pays en 2016/17 (Royaume-Uni regroupé avec l'UE ici) ; la consommation de l'Asie importatrice est apparente (Corée, Taïwan, Singapour ; saut des Philippines en 2015/16) ; les stocks américains sont figés à 5,7 M sacs depuis 2022/23 ; les stocks indonésiens font une bosse en 2017-2021 ; les exportations mondiales dépassent les importations de 0,8 à 12,8 M sacs selon l'année.</w:t>
+        <w:t xml:space="preserve">Crise et reprise (section 5) : simples différences de moyennes, sans modèle. Tendances et parts de l'offre robusta et arabica sur 2011/12-2025/26 (saut de niveau du Vietnam entre 2010/11 et 2011/12).</w:t>
       </w:r>
     </w:p>
     <w:p>
@@ -9897,7 +10017,7 @@
         </w:numPr>
       </w:pPr>
       <w:r>
-        <w:t xml:space="preserve">Chiffres révisés : l'étude utilise les données USDA de juillet 2026, révisées après coup. Le marché, lui, réagit aux prévisions du moment (USDA, CONAB, ICO). Une étude des révisions de prévisions, mois par mois, serait le test direct de « qui mène ».</w:t>
+        <w:t xml:space="preserve">Pièges des données : la consommation de l'UE est apparente (miroir des stocks) et le périmètre passe de 28 à 27 pays en 2016/17 (Royaume-Uni regroupé avec l'UE ici) ; la consommation de l'Asie importatrice est apparente (Corée, Taïwan, Singapour ; saut des Philippines en 2015/16) ; les stocks américains sont figés à 5,7 M sacs depuis 2022/23 ; les stocks indonésiens font une bosse en 2017-2021 ; les exportations mondiales dépassent les importations de 0,8 à 12,8 M sacs selon l'année.</w:t>
       </w:r>
     </w:p>
     <w:p>
@@ -9909,7 +10029,19 @@
         </w:numPr>
       </w:pPr>
       <w:r>
-        <w:t xml:space="preserve">Non testé faute de données : taux de change (real, dollar), positions des fonds, fret, taux d'intérêt, prix en réals pour le producteur brésilien, cours quotidiens.</w:t>
+        <w:t xml:space="preserve">Chiffres révisés : l'étude utilise les données USDA de juillet 2026, révisées après coup. Le marché, lui, réagit aux prévisions du moment (USDA, CONAB, ICO). Une étude des révisions de prévisions, mois par mois, serait le test direct de « qui mène ».</w:t>
+      </w:r>
+    </w:p>
+    <w:p>
+      <w:pPr>
+        <w:pStyle w:val="ListBullet"/>
+        <w:numPr>
+          <w:ilvl w:val="0"/>
+          <w:numId w:val="1"/>
+        </w:numPr>
+      </w:pPr>
+      <w:r>
+        <w:t xml:space="preserve">Non testé faute de données : dollar, positions des fonds, fret, taux d'intérêt, prix en réals pour le producteur brésilien, cours intrajournaliers ; le real n'est testé que sur 2021-2026, au pas hebdomadaire.</w:t>
       </w:r>
     </w:p>
     <w:p>

</xml_diff>